<commit_message>
fix: update CV privacy, degree labels and download buttons
</commit_message>
<xml_diff>
--- a/cv/CV_LSH_c_2026.docx
+++ b/cv/CV_LSH_c_2026.docx
@@ -98,7 +98,7 @@
           <w:kern w:val="0"/>
           <w:sz w:val="24"/>
         </w:rPr>
-        <w:t xml:space="preserve">香港科技大学 土木及环境工程学系 博士研究生</w:t>
+        <w:t xml:space="preserve">香港科技大学 土木工程 博士研究生</w:t>
       </w:r>
     </w:p>
     <w:p>
@@ -120,7 +120,7 @@
         <w:rPr>
           <w:rFonts w:hint="eastAsia" w:eastAsia="宋体"/>
         </w:rPr>
-        <w:t xml:space="preserve">电话：(+86) 157 1055 1578</w:t>
+        <w:t xml:space="preserve"/>
       </w:r>
     </w:p>
     <w:p>
@@ -131,7 +131,7 @@
         <w:rPr>
           <w:rFonts w:hint="eastAsia" w:eastAsia="宋体"/>
         </w:rPr>
-        <w:t xml:space="preserve">地址：香港特别行政区 清水湾 香港科技大学 Tower A</w:t>
+        <w:t xml:space="preserve"/>
       </w:r>
     </w:p>
     <w:p>
@@ -245,7 +245,7 @@
           <w:b w:val="0"/>
           <w:i w:val="0"/>
         </w:rPr>
-        <w:t xml:space="preserve">现为香港科技大学土木及环境工程学系博士一年级研究生，获</w:t>
+        <w:t xml:space="preserve">现为香港科技大学土木工程博士一年级研究生，获</w:t>
       </w:r>
       <w:r>
         <w:rPr>
@@ -633,7 +633,7 @@
                 <w:b/>
                 <w:i w:val="0"/>
               </w:rPr>
-              <w:t xml:space="preserve">土木及环境工程 博士在读</w:t>
+              <w:t xml:space="preserve">土木工程 博士在读</w:t>
             </w:r>
           </w:p>
         </w:tc>

</xml_diff>